<commit_message>
Set the journal section to Mechanics / theoretical mechanics, machine dynamics
The authors pointed out the rubric of the journal that fits the paper.

Co-Authored-By: Claude Opus 5.5 <noreply@anthropic.com>
Claude-Session: https://claude.ai/code/session_01TghREcADSXLD5g77F5Hqb2
</commit_message>
<xml_diff>
--- a/article/journal/submission/Авторское_заявление.docx
+++ b/article/journal/submission/Авторское_заявление.docx
@@ -120,7 +120,7 @@
           <w:b w:val="0"/>
           <w:u w:val="single"/>
         </w:rPr>
-        <w:t>Машиностроение и машиноведение</w:t>
+        <w:t>Механика</w:t>
         <w:tab/>
       </w:r>
     </w:p>
@@ -144,7 +144,7 @@
           <w:b w:val="0"/>
           <w:u w:val="single"/>
         </w:rPr>
-        <w:t>Расчет и конструирование машин</w:t>
+        <w:t>Теоретическая механика, динамика машин</w:t>
         <w:tab/>
       </w:r>
     </w:p>

</xml_diff>